<commit_message>
Alinear wireframes y requerimientos con PR-MEL-OPFC-001 v12
- Renombrar Kiplas → Keyplus (nombre correcto del sistema de cerraduras)
- Check-in: flujo oficial de 6 etapas (validación, asignación con cama P/V y
  casillero, chequeo de condiciones, registro en SAMTECH/SharePoint,
  enrolamiento Keyplus, onboarding)
- Check-out: diferenciación automático vs manual, revisión en terreno,
  derivaciones automáticas de OT (limpieza, sábanas, facility)
- Portal Empresa: soporte multi-campamento (5400/VMH/VVL/VCA), ficha con CO,
  ADC, Focal Point, OPEX/CAPEX, regla 96h y tipos de contrato
- Dashboard: nuevo KPI "Dobles Asignaciones" con registro en KPI-SharePoint
- Requerimientos .docx v1.1: SAMTECH como sistema integrado, nuevos RF para
  el flujo oficial, glosario ampliado (Keyplus, SAMTECH, CO/ADC, OPEX/CAPEX,
  regla 96h, multi-campamento)

Co-Authored-By: Claude Sonnet 4.6 <noreply@anthropic.com>
</commit_message>
<xml_diff>
--- a/docs/requerimientos-hoteleria.docx
+++ b/docs/requerimientos-hoteleria.docx
@@ -69,7 +69,7 @@
           <w:rFonts w:ascii="Arial" w:hAnsi="Arial"/>
           <w:sz w:val="22"/>
         </w:rPr>
-        <w:t>1.0</w:t>
+        <w:t>1.1</w:t>
       </w:r>
     </w:p>
     <w:p>
@@ -90,6 +90,26 @@
           <w:sz w:val="22"/>
         </w:rPr>
         <w:t>Abril 2026</w:t>
+      </w:r>
+    </w:p>
+    <w:p>
+      <w:pPr>
+        <w:jc w:val="center"/>
+      </w:pPr>
+      <w:r>
+        <w:rPr>
+          <w:rFonts w:ascii="Arial" w:hAnsi="Arial"/>
+          <w:b/>
+          <w:sz w:val="22"/>
+        </w:rPr>
+        <w:t xml:space="preserve">Procedimiento base: </w:t>
+      </w:r>
+      <w:r>
+        <w:rPr>
+          <w:rFonts w:ascii="Arial" w:hAnsi="Arial"/>
+          <w:sz w:val="22"/>
+        </w:rPr>
+        <w:t>PR-MEL-OPFC-001 v12 (31-03-2026)</w:t>
       </w:r>
     </w:p>
     <w:p>
@@ -462,6 +482,11 @@
     </w:p>
     <w:p>
       <w:r>
+        <w:t>El proyecto se alinea con el procedimiento oficial PR-MEL-OPFC-001 v12 (Asignacion de Habitaciones, 31-03-2026) y soporta los campamentos 5400 (BCA), VMH, VVL y VCA.</w:t>
+      </w:r>
+    </w:p>
+    <w:p>
+      <w:r>
         <w:t>El sistema cubrira los siguientes modulos:</w:t>
       </w:r>
     </w:p>
@@ -478,7 +503,7 @@
         <w:pStyle w:val="ListBullet"/>
       </w:pPr>
       <w:r>
-        <w:t>Gestion de Empresas y Dotacion (portal de autoservicio, carga semanal)</w:t>
+        <w:t>Gestion de Empresas y Dotacion (portal de autoservicio, curva semanal, cupos)</w:t>
       </w:r>
     </w:p>
     <w:p>
@@ -494,7 +519,7 @@
         <w:pStyle w:val="ListBullet"/>
       </w:pPr>
       <w:r>
-        <w:t>Gestion de Tarjetas Electronicas (llaves de acceso Kiplas)</w:t>
+        <w:t>Gestion de Tarjetas Electronicas (llaves de acceso Keyplus)</w:t>
       </w:r>
     </w:p>
     <w:p>
@@ -510,7 +535,7 @@
         <w:pStyle w:val="ListBullet"/>
       </w:pPr>
       <w:r>
-        <w:t>Conciliacion OnTracking vs Kiplas</w:t>
+        <w:t>Integracion y Conciliacion (OnTracking, SAMTECH, Keyplus, SharePoint)</w:t>
       </w:r>
     </w:p>
     <w:p>
@@ -518,7 +543,7 @@
         <w:pStyle w:val="ListBullet"/>
       </w:pPr>
       <w:r>
-        <w:t>Reporteria y Analitica</w:t>
+        <w:t>Reporteria y Analitica (incluye KPI-SharePoint de excepciones)</w:t>
       </w:r>
     </w:p>
     <w:p>
@@ -647,7 +672,37 @@
                 <w:rFonts w:ascii="Arial" w:hAnsi="Arial"/>
                 <w:sz w:val="20"/>
               </w:rPr>
-              <w:t>Kiplas</w:t>
+              <w:t>SAMTECH</w:t>
+            </w:r>
+          </w:p>
+        </w:tc>
+        <w:tc>
+          <w:tcPr>
+            <w:tcW w:type="dxa" w:w="4680"/>
+          </w:tcPr>
+          <w:p>
+            <w:r>
+              <w:rPr>
+                <w:rFonts w:ascii="Arial" w:hAnsi="Arial"/>
+                <w:sz w:val="20"/>
+              </w:rPr>
+              <w:t>Sistema corporativo para registro de check-ins y censos</w:t>
+            </w:r>
+          </w:p>
+        </w:tc>
+      </w:tr>
+      <w:tr>
+        <w:tc>
+          <w:tcPr>
+            <w:tcW w:type="dxa" w:w="4680"/>
+          </w:tcPr>
+          <w:p>
+            <w:r>
+              <w:rPr>
+                <w:rFonts w:ascii="Arial" w:hAnsi="Arial"/>
+                <w:sz w:val="20"/>
+              </w:rPr>
+              <w:t>Keyplus</w:t>
             </w:r>
           </w:p>
         </w:tc>
@@ -662,6 +717,66 @@
                 <w:sz w:val="20"/>
               </w:rPr>
               <w:t>Sistema de cerraduras electronicas (origen chino)</w:t>
+            </w:r>
+          </w:p>
+        </w:tc>
+      </w:tr>
+      <w:tr>
+        <w:tc>
+          <w:tcPr>
+            <w:tcW w:type="dxa" w:w="4680"/>
+          </w:tcPr>
+          <w:p>
+            <w:r>
+              <w:rPr>
+                <w:rFonts w:ascii="Arial" w:hAnsi="Arial"/>
+                <w:sz w:val="20"/>
+              </w:rPr>
+              <w:t>SharePoint</w:t>
+            </w:r>
+          </w:p>
+        </w:tc>
+        <w:tc>
+          <w:tcPr>
+            <w:tcW w:type="dxa" w:w="4680"/>
+          </w:tcPr>
+          <w:p>
+            <w:r>
+              <w:rPr>
+                <w:rFonts w:ascii="Arial" w:hAnsi="Arial"/>
+                <w:sz w:val="20"/>
+              </w:rPr>
+              <w:t>Repositorio donde se publica el KPI de excepciones (dobles asignaciones)</w:t>
+            </w:r>
+          </w:p>
+        </w:tc>
+      </w:tr>
+      <w:tr>
+        <w:tc>
+          <w:tcPr>
+            <w:tcW w:type="dxa" w:w="4680"/>
+          </w:tcPr>
+          <w:p>
+            <w:r>
+              <w:rPr>
+                <w:rFonts w:ascii="Arial" w:hAnsi="Arial"/>
+                <w:sz w:val="20"/>
+              </w:rPr>
+              <w:t>PR-MEL-OPFC-001</w:t>
+            </w:r>
+          </w:p>
+        </w:tc>
+        <w:tc>
+          <w:tcPr>
+            <w:tcW w:type="dxa" w:w="4680"/>
+          </w:tcPr>
+          <w:p>
+            <w:r>
+              <w:rPr>
+                <w:rFonts w:ascii="Arial" w:hAnsi="Arial"/>
+                <w:sz w:val="20"/>
+              </w:rPr>
+              <w:t>Procedimiento oficial de asignacion de habitaciones v12 (31-03-2026)</w:t>
             </w:r>
           </w:p>
         </w:tc>
@@ -707,6 +822,126 @@
                 <w:rFonts w:ascii="Arial" w:hAnsi="Arial"/>
                 <w:sz w:val="20"/>
               </w:rPr>
+              <w:t>CO / ADC</w:t>
+            </w:r>
+          </w:p>
+        </w:tc>
+        <w:tc>
+          <w:tcPr>
+            <w:tcW w:type="dxa" w:w="4680"/>
+          </w:tcPr>
+          <w:p>
+            <w:r>
+              <w:rPr>
+                <w:rFonts w:ascii="Arial" w:hAnsi="Arial"/>
+                <w:sz w:val="20"/>
+              </w:rPr>
+              <w:t>Contract Owner y Administrador de Contrato por parte del mandante</w:t>
+            </w:r>
+          </w:p>
+        </w:tc>
+      </w:tr>
+      <w:tr>
+        <w:tc>
+          <w:tcPr>
+            <w:tcW w:type="dxa" w:w="4680"/>
+          </w:tcPr>
+          <w:p>
+            <w:r>
+              <w:rPr>
+                <w:rFonts w:ascii="Arial" w:hAnsi="Arial"/>
+                <w:sz w:val="20"/>
+              </w:rPr>
+              <w:t>Focal Point</w:t>
+            </w:r>
+          </w:p>
+        </w:tc>
+        <w:tc>
+          <w:tcPr>
+            <w:tcW w:type="dxa" w:w="4680"/>
+          </w:tcPr>
+          <w:p>
+            <w:r>
+              <w:rPr>
+                <w:rFonts w:ascii="Arial" w:hAnsi="Arial"/>
+                <w:sz w:val="20"/>
+              </w:rPr>
+              <w:t>Contraparte en la empresa que coordina la curva y dotacion</w:t>
+            </w:r>
+          </w:p>
+        </w:tc>
+      </w:tr>
+      <w:tr>
+        <w:tc>
+          <w:tcPr>
+            <w:tcW w:type="dxa" w:w="4680"/>
+          </w:tcPr>
+          <w:p>
+            <w:r>
+              <w:rPr>
+                <w:rFonts w:ascii="Arial" w:hAnsi="Arial"/>
+                <w:sz w:val="20"/>
+              </w:rPr>
+              <w:t>Cama P/V</w:t>
+            </w:r>
+          </w:p>
+        </w:tc>
+        <w:tc>
+          <w:tcPr>
+            <w:tcW w:type="dxa" w:w="4680"/>
+          </w:tcPr>
+          <w:p>
+            <w:r>
+              <w:rPr>
+                <w:rFonts w:ascii="Arial" w:hAnsi="Arial"/>
+                <w:sz w:val="20"/>
+              </w:rPr>
+              <w:t>Cama Principal / Vacante en la asignacion de habitacion</w:t>
+            </w:r>
+          </w:p>
+        </w:tc>
+      </w:tr>
+      <w:tr>
+        <w:tc>
+          <w:tcPr>
+            <w:tcW w:type="dxa" w:w="4680"/>
+          </w:tcPr>
+          <w:p>
+            <w:r>
+              <w:rPr>
+                <w:rFonts w:ascii="Arial" w:hAnsi="Arial"/>
+                <w:sz w:val="20"/>
+              </w:rPr>
+              <w:t>OPEX / CAPEX</w:t>
+            </w:r>
+          </w:p>
+        </w:tc>
+        <w:tc>
+          <w:tcPr>
+            <w:tcW w:type="dxa" w:w="4680"/>
+          </w:tcPr>
+          <w:p>
+            <w:r>
+              <w:rPr>
+                <w:rFonts w:ascii="Arial" w:hAnsi="Arial"/>
+                <w:sz w:val="20"/>
+              </w:rPr>
+              <w:t>Clasificacion del centro de costo del contrato</w:t>
+            </w:r>
+          </w:p>
+        </w:tc>
+      </w:tr>
+      <w:tr>
+        <w:tc>
+          <w:tcPr>
+            <w:tcW w:type="dxa" w:w="4680"/>
+          </w:tcPr>
+          <w:p>
+            <w:r>
+              <w:rPr>
+                <w:rFonts w:ascii="Arial" w:hAnsi="Arial"/>
+                <w:sz w:val="20"/>
+              </w:rPr>
               <w:t>Near-miss</w:t>
             </w:r>
           </w:p>
@@ -722,6 +957,36 @@
                 <w:sz w:val="20"/>
               </w:rPr>
               <w:t>Incidente de seguridad potencial (ej: asignacion de habitacion mixta)</w:t>
+            </w:r>
+          </w:p>
+        </w:tc>
+      </w:tr>
+      <w:tr>
+        <w:tc>
+          <w:tcPr>
+            <w:tcW w:type="dxa" w:w="4680"/>
+          </w:tcPr>
+          <w:p>
+            <w:r>
+              <w:rPr>
+                <w:rFonts w:ascii="Arial" w:hAnsi="Arial"/>
+                <w:sz w:val="20"/>
+              </w:rPr>
+              <w:t>Doble Asignacion</w:t>
+            </w:r>
+          </w:p>
+        </w:tc>
+        <w:tc>
+          <w:tcPr>
+            <w:tcW w:type="dxa" w:w="4680"/>
+          </w:tcPr>
+          <w:p>
+            <w:r>
+              <w:rPr>
+                <w:rFonts w:ascii="Arial" w:hAnsi="Arial"/>
+                <w:sz w:val="20"/>
+              </w:rPr>
+              <w:t>Excepcion donde una habitacion queda asignada a dos personas; se registra en KPI-SharePoint</w:t>
             </w:r>
           </w:p>
         </w:tc>
@@ -767,7 +1032,7 @@
                 <w:rFonts w:ascii="Arial" w:hAnsi="Arial"/>
                 <w:sz w:val="20"/>
               </w:rPr>
-              <w:t>BCA</w:t>
+              <w:t>BCA / 5400</w:t>
             </w:r>
           </w:p>
         </w:tc>
@@ -781,7 +1046,37 @@
                 <w:rFonts w:ascii="Arial" w:hAnsi="Arial"/>
                 <w:sz w:val="20"/>
               </w:rPr>
-              <w:t>Nombre del campamento operado por Aramark</w:t>
+              <w:t>Campamento principal operado por Aramark; codigo interno 5400</w:t>
+            </w:r>
+          </w:p>
+        </w:tc>
+      </w:tr>
+      <w:tr>
+        <w:tc>
+          <w:tcPr>
+            <w:tcW w:type="dxa" w:w="4680"/>
+          </w:tcPr>
+          <w:p>
+            <w:r>
+              <w:rPr>
+                <w:rFonts w:ascii="Arial" w:hAnsi="Arial"/>
+                <w:sz w:val="20"/>
+              </w:rPr>
+              <w:t>VMH / VVL / VCA</w:t>
+            </w:r>
+          </w:p>
+        </w:tc>
+        <w:tc>
+          <w:tcPr>
+            <w:tcW w:type="dxa" w:w="4680"/>
+          </w:tcPr>
+          <w:p>
+            <w:r>
+              <w:rPr>
+                <w:rFonts w:ascii="Arial" w:hAnsi="Arial"/>
+                <w:sz w:val="20"/>
+              </w:rPr>
+              <w:t>Otros campamentos soportados por la plataforma</w:t>
             </w:r>
           </w:p>
         </w:tc>
@@ -876,6 +1171,36 @@
           </w:p>
         </w:tc>
       </w:tr>
+      <w:tr>
+        <w:tc>
+          <w:tcPr>
+            <w:tcW w:type="dxa" w:w="4680"/>
+          </w:tcPr>
+          <w:p>
+            <w:r>
+              <w:rPr>
+                <w:rFonts w:ascii="Arial" w:hAnsi="Arial"/>
+                <w:sz w:val="20"/>
+              </w:rPr>
+              <w:t>Regla 96h</w:t>
+            </w:r>
+          </w:p>
+        </w:tc>
+        <w:tc>
+          <w:tcPr>
+            <w:tcW w:type="dxa" w:w="4680"/>
+          </w:tcPr>
+          <w:p>
+            <w:r>
+              <w:rPr>
+                <w:rFonts w:ascii="Arial" w:hAnsi="Arial"/>
+                <w:sz w:val="20"/>
+              </w:rPr>
+              <w:t>Anticipacion minima para solicitud de reserva (cierre Martes 18:00)</w:t>
+            </w:r>
+          </w:p>
+        </w:tc>
+      </w:tr>
     </w:tbl>
     <w:p>
       <w:r>
@@ -908,7 +1233,7 @@
     </w:p>
     <w:p>
       <w:r>
-        <w:t>La plataforma sera un sistema web unificado que integrara los procesos actualmente dispersos en multiples planillas Excel, el sistema OnTracking (asignacion de habitaciones) y el sistema Kiplas (cerraduras electronicas). Reemplazara las aplicaciones locales desarrolladas por Javier Rivera, profesionalizandolas e integrandolas en una solucion estandarizada a nivel de compania.</w:t>
+        <w:t>La plataforma sera un sistema web unificado que integrara los procesos actualmente dispersos en multiples planillas Excel, el sistema OnTracking (asignacion de habitaciones), el sistema SAMTECH (registro de check-ins / censos) y el sistema Keyplus (cerraduras electronicas). Reemplazara las aplicaciones locales desarrolladas por Javier Rivera, profesionalizandolas e integrandolas en una solucion estandarizada a nivel de compania, alineada con el procedimiento oficial PR-MEL-OPFC-001 v12.</w:t>
       </w:r>
     </w:p>
     <w:p>
@@ -1132,7 +1457,7 @@
         <w:pStyle w:val="ListBullet"/>
       </w:pPr>
       <w:r>
-        <w:t>El sistema Kiplas (cerraduras electronicas) no exporta el RUT en sus reportes, lo que impide la conciliacion automatica directa. Se debe utilizar habitacion + timestamp como alternativa.</w:t>
+        <w:t>El sistema Keyplus (cerraduras electronicas) no exporta el RUT en sus reportes, lo que impide la conciliacion automatica directa. Se debe utilizar habitacion + timestamp como alternativa.</w:t>
       </w:r>
     </w:p>
     <w:p>
@@ -1140,7 +1465,7 @@
         <w:pStyle w:val="ListBullet"/>
       </w:pPr>
       <w:r>
-        <w:t>Los reportes de Kiplas estan limitados a 1,000 columnas por informe.</w:t>
+        <w:t>Los reportes de Keyplus estan limitados a 1,000 columnas por informe.</w:t>
       </w:r>
     </w:p>
     <w:p>
@@ -1156,7 +1481,7 @@
         <w:pStyle w:val="ListBullet"/>
       </w:pPr>
       <w:r>
-        <w:t>Existen 55+ tipos de turno diferentes (7x7, 10x10, 14x14, etc.) que generan entre 600 y 700 ineficiencias diarias.</w:t>
+        <w:t>Existen 55+ tipos de turno diferentes (7x7, 10x10, 14x14, 4x3, 8x6, etc.) que generan entre 600 y 700 ineficiencias diarias.</w:t>
       </w:r>
     </w:p>
     <w:p>
@@ -1165,6 +1490,30 @@
       </w:pPr>
       <w:r>
         <w:t>Se manejan 162+ empresas con permisos y cupos distintos.</w:t>
+      </w:r>
+    </w:p>
+    <w:p>
+      <w:pPr>
+        <w:pStyle w:val="ListBullet"/>
+      </w:pPr>
+      <w:r>
+        <w:t>Las solicitudes de reserva tienen una anticipacion minima de 96 horas; el cierre de curva semanal es el Martes a las 18:00.</w:t>
+      </w:r>
+    </w:p>
+    <w:p>
+      <w:pPr>
+        <w:pStyle w:val="ListBullet"/>
+      </w:pPr>
+      <w:r>
+        <w:t>Las dobles asignaciones son excepciones que deben registrarse en el KPI-SharePoint segun el procedimiento PR-MEL-OPFC-001 v12.</w:t>
+      </w:r>
+    </w:p>
+    <w:p>
+      <w:pPr>
+        <w:pStyle w:val="ListBullet"/>
+      </w:pPr>
+      <w:r>
+        <w:t>El sistema debe operar para multiples campamentos (5400 BCA, VMH, VVL, VCA) con configuracion independiente por sitio.</w:t>
       </w:r>
     </w:p>
     <w:p>
@@ -1218,7 +1567,7 @@
           <w:rFonts w:ascii="Arial" w:hAnsi="Arial"/>
           <w:sz w:val="22"/>
         </w:rPr>
-        <w:t>El sistema debe permitir el check-in de usuarios validando restricciones de genero de la habitacion, disponibilidad de cupos de la empresa y estado de autorizacion.</w:t>
+        <w:t>El sistema debe implementar el check-in segun el flujo PR-MEL-OPFC-001 v12 con las siguientes etapas: (a) validacion del huesped y 96h de anticipacion, (b) asignacion de habitacion y cama P/V, (c) chequeo de condiciones (aseo, sabanas, casillero, infraestructura), (d) registro en sistemas (Planilla de Reservas, SAMTECH/SharePoint, enrolamiento Keyplus), (e) onboarding (Reglamento Interno, induccion, entregas).</w:t>
       </w:r>
     </w:p>
     <w:p>
@@ -1235,7 +1584,7 @@
           <w:rFonts w:ascii="Arial" w:hAnsi="Arial"/>
           <w:sz w:val="22"/>
         </w:rPr>
-        <w:t>El sistema debe permitir el check-out liberando automaticamente la habitacion y generando una notificacion al area de Facility para cambio de sabanas y limpieza.</w:t>
+        <w:t>El sistema debe capturar los datos de check-in: RUT, nombre, sexo, contacto, cargo, tipo de usuario, empresa, tipo de contrato (Permanente/Spot/SD-PM/Outage/Proyecto/LSTS), centro de costo y clasificacion OPEX/CAPEX.</w:t>
       </w:r>
     </w:p>
     <w:p>
@@ -1252,7 +1601,7 @@
           <w:rFonts w:ascii="Arial" w:hAnsi="Arial"/>
           <w:sz w:val="22"/>
         </w:rPr>
-        <w:t>El sistema debe asignar habitaciones automaticamente respetando las reglas de restriccion de genero establecidas por modulo.</w:t>
+        <w:t>El sistema debe registrar habitacion, cama P/V, casillero asignado, fecha/hora de llegada y bajada, sistema de turno (4x3, 7x7, 8x6, 10x10, 14x14) y tipo de turno (Dia/Noche).</w:t>
       </w:r>
     </w:p>
     <w:p>
@@ -1269,7 +1618,7 @@
           <w:rFonts w:ascii="Arial" w:hAnsi="Arial"/>
           <w:sz w:val="22"/>
         </w:rPr>
-        <w:t>El sistema debe mostrar un dashboard de ocupacion en tiempo real, desglosado por modulo, empresa y tipo de turno.</w:t>
+        <w:t>El sistema debe soportar check-out manual y check-out automatico basado en eventos de OnTracking/Keyplus, y mantener una bandeja de pendientes de revision en terreno.</w:t>
       </w:r>
     </w:p>
     <w:p>
@@ -1286,7 +1635,7 @@
           <w:rFonts w:ascii="Arial" w:hAnsi="Arial"/>
           <w:sz w:val="22"/>
         </w:rPr>
-        <w:t>El sistema debe detectar y visualizar las ineficiencias diarias (estimadas en 600-700 camas), identificando habitaciones con ocupacion inferior al 100%.</w:t>
+        <w:t>La revision en terreno durante el check-out debe incluir: devolucion de tarjeta Keyplus, devolucion de llave de casillero, inspeccion de habitacion, pertenencias, registro de danos y liberacion de casillero.</w:t>
       </w:r>
     </w:p>
     <w:p>
@@ -1303,6 +1652,91 @@
           <w:rFonts w:ascii="Arial" w:hAnsi="Arial"/>
           <w:sz w:val="22"/>
         </w:rPr>
+        <w:t>Al realizar un check-out, el sistema debe generar automaticamente las derivaciones correspondientes: OT de Limpieza, cambio de sabanas (segun ciclo del turno) y OT de Facility si se detectan danos.</w:t>
+      </w:r>
+    </w:p>
+    <w:p>
+      <w:r>
+        <w:rPr>
+          <w:rFonts w:ascii="Arial" w:hAnsi="Arial"/>
+          <w:b/>
+          <w:sz w:val="22"/>
+        </w:rPr>
+        <w:t xml:space="preserve">RF-1.7: </w:t>
+      </w:r>
+      <w:r>
+        <w:rPr>
+          <w:rFonts w:ascii="Arial" w:hAnsi="Arial"/>
+          <w:sz w:val="22"/>
+        </w:rPr>
+        <w:t>El sistema debe asignar habitaciones automaticamente respetando las reglas de restriccion de genero establecidas por modulo.</w:t>
+      </w:r>
+    </w:p>
+    <w:p>
+      <w:r>
+        <w:rPr>
+          <w:rFonts w:ascii="Arial" w:hAnsi="Arial"/>
+          <w:b/>
+          <w:sz w:val="22"/>
+        </w:rPr>
+        <w:t xml:space="preserve">RF-1.8: </w:t>
+      </w:r>
+      <w:r>
+        <w:rPr>
+          <w:rFonts w:ascii="Arial" w:hAnsi="Arial"/>
+          <w:sz w:val="22"/>
+        </w:rPr>
+        <w:t>El sistema debe gestionar el caso de excepcion 'Doble Asignacion', bloqueandolo por defecto y, si es autorizado, registrando la ocurrencia en el KPI-SharePoint.</w:t>
+      </w:r>
+    </w:p>
+    <w:p>
+      <w:r>
+        <w:rPr>
+          <w:rFonts w:ascii="Arial" w:hAnsi="Arial"/>
+          <w:b/>
+          <w:sz w:val="22"/>
+        </w:rPr>
+        <w:t xml:space="preserve">RF-1.9: </w:t>
+      </w:r>
+      <w:r>
+        <w:rPr>
+          <w:rFonts w:ascii="Arial" w:hAnsi="Arial"/>
+          <w:sz w:val="22"/>
+        </w:rPr>
+        <w:t>El sistema debe mostrar un dashboard de ocupacion en tiempo real, desglosado por campamento, modulo, empresa y tipo de turno, incluyendo el KPI diario de dobles asignaciones.</w:t>
+      </w:r>
+    </w:p>
+    <w:p>
+      <w:r>
+        <w:rPr>
+          <w:rFonts w:ascii="Arial" w:hAnsi="Arial"/>
+          <w:b/>
+          <w:sz w:val="22"/>
+        </w:rPr>
+        <w:t xml:space="preserve">RF-1.10: </w:t>
+      </w:r>
+      <w:r>
+        <w:rPr>
+          <w:rFonts w:ascii="Arial" w:hAnsi="Arial"/>
+          <w:sz w:val="22"/>
+        </w:rPr>
+        <w:t>El sistema debe detectar y visualizar las ineficiencias diarias (estimadas en 600-700 camas), identificando habitaciones con ocupacion inferior al 100%.</w:t>
+      </w:r>
+    </w:p>
+    <w:p>
+      <w:r>
+        <w:rPr>
+          <w:rFonts w:ascii="Arial" w:hAnsi="Arial"/>
+          <w:b/>
+          <w:sz w:val="22"/>
+        </w:rPr>
+        <w:t xml:space="preserve">RF-1.11: </w:t>
+      </w:r>
+      <w:r>
+        <w:rPr>
+          <w:rFonts w:ascii="Arial" w:hAnsi="Arial"/>
+          <w:sz w:val="22"/>
+        </w:rPr>
         <w:t>El sistema debe presentar un mapa visual del campamento mostrando el estado de ocupacion de cada modulo y habitacion con codigos de color.</w:t>
       </w:r>
     </w:p>
@@ -1313,7 +1747,7 @@
           <w:b/>
           <w:sz w:val="22"/>
         </w:rPr>
-        <w:t xml:space="preserve">RF-1.7: </w:t>
+        <w:t xml:space="preserve">RF-1.12: </w:t>
       </w:r>
       <w:r>
         <w:rPr>
@@ -1349,7 +1783,7 @@
           <w:rFonts w:ascii="Arial" w:hAnsi="Arial"/>
           <w:sz w:val="22"/>
         </w:rPr>
-        <w:t>El sistema debe proveer un portal de autoservicio para las 162+ empresas donde puedan gestionar su dotacion, cupos y usuarios.</w:t>
+        <w:t>El sistema debe proveer un portal de autoservicio para las 162+ empresas donde puedan gestionar su dotacion, cupos y usuarios, con selector de campamento (5400/VMH/VVL/VCA).</w:t>
       </w:r>
     </w:p>
     <w:p>
@@ -1366,7 +1800,7 @@
           <w:rFonts w:ascii="Arial" w:hAnsi="Arial"/>
           <w:sz w:val="22"/>
         </w:rPr>
-        <w:t>El sistema debe permitir la carga semanal de dotacion mediante archivo Excel o via API, eliminando la intervencion manual del recepcionista.</w:t>
+        <w:t>El portal debe mostrar la ficha de la empresa con: Razon Social, N° de Contrato, Gerencia General, Area, Contract Owner (CO), ADC, Focal Point Empresa y clasificacion OPEX/CAPEX.</w:t>
       </w:r>
     </w:p>
     <w:p>
@@ -1383,7 +1817,7 @@
           <w:rFonts w:ascii="Arial" w:hAnsi="Arial"/>
           <w:sz w:val="22"/>
         </w:rPr>
-        <w:t>El sistema debe validar automaticamente los datos de dotacion cargados, verificando consistencia de genero, cupos disponibles y formatos de RUT.</w:t>
+        <w:t>El sistema debe permitir la carga semanal de dotacion mediante archivo Excel o via API, eliminando la intervencion manual del recepcionista.</w:t>
       </w:r>
     </w:p>
     <w:p>
@@ -1400,7 +1834,7 @@
           <w:rFonts w:ascii="Arial" w:hAnsi="Arial"/>
           <w:sz w:val="22"/>
         </w:rPr>
-        <w:t>El sistema debe gestionar los cupos por empresa con un mecanismo de recuperacion de cupos subutilizados, permitiendo reasignarlos a otras empresas.</w:t>
+        <w:t>El sistema debe aplicar la regla de 96 horas de anticipacion para solicitudes de reserva, con corte de curva semanal el Martes 18:00 y bloqueo de cargas fuera de plazo (salvo excepcion autorizada).</w:t>
       </w:r>
     </w:p>
     <w:p>
@@ -1417,7 +1851,75 @@
           <w:rFonts w:ascii="Arial" w:hAnsi="Arial"/>
           <w:sz w:val="22"/>
         </w:rPr>
+        <w:t>Toda solicitud debe incluir: ID auto-generado, campamento destino, sistema de turno, tipo de turno, tipo de contrato, centro de costo y clasificacion OPEX/CAPEX.</w:t>
+      </w:r>
+    </w:p>
+    <w:p>
+      <w:r>
+        <w:rPr>
+          <w:rFonts w:ascii="Arial" w:hAnsi="Arial"/>
+          <w:b/>
+          <w:sz w:val="22"/>
+        </w:rPr>
+        <w:t xml:space="preserve">RF-2.6: </w:t>
+      </w:r>
+      <w:r>
+        <w:rPr>
+          <w:rFonts w:ascii="Arial" w:hAnsi="Arial"/>
+          <w:sz w:val="22"/>
+        </w:rPr>
+        <w:t>El sistema debe validar automaticamente los datos de dotacion cargados, verificando consistencia de genero, cupos disponibles y formatos de RUT.</w:t>
+      </w:r>
+    </w:p>
+    <w:p>
+      <w:r>
+        <w:rPr>
+          <w:rFonts w:ascii="Arial" w:hAnsi="Arial"/>
+          <w:b/>
+          <w:sz w:val="22"/>
+        </w:rPr>
+        <w:t xml:space="preserve">RF-2.7: </w:t>
+      </w:r>
+      <w:r>
+        <w:rPr>
+          <w:rFonts w:ascii="Arial" w:hAnsi="Arial"/>
+          <w:sz w:val="22"/>
+        </w:rPr>
+        <w:t>El sistema debe gestionar los cupos por empresa con un mecanismo de recuperacion de cupos subutilizados, permitiendo reasignarlos a otras empresas.</w:t>
+      </w:r>
+    </w:p>
+    <w:p>
+      <w:r>
+        <w:rPr>
+          <w:rFonts w:ascii="Arial" w:hAnsi="Arial"/>
+          <w:b/>
+          <w:sz w:val="22"/>
+        </w:rPr>
+        <w:t xml:space="preserve">RF-2.8: </w:t>
+      </w:r>
+      <w:r>
+        <w:rPr>
+          <w:rFonts w:ascii="Arial" w:hAnsi="Arial"/>
+          <w:sz w:val="22"/>
+        </w:rPr>
         <w:t>El sistema debe soportar formularios QR diferenciados por empresa (hasta 155 formularios) para agilizar el proceso de check-in.</w:t>
+      </w:r>
+    </w:p>
+    <w:p>
+      <w:r>
+        <w:rPr>
+          <w:rFonts w:ascii="Arial" w:hAnsi="Arial"/>
+          <w:b/>
+          <w:sz w:val="22"/>
+        </w:rPr>
+        <w:t xml:space="preserve">RF-2.9: </w:t>
+      </w:r>
+      <w:r>
+        <w:rPr>
+          <w:rFonts w:ascii="Arial" w:hAnsi="Arial"/>
+          <w:sz w:val="22"/>
+        </w:rPr>
+        <w:t>El portal debe mostrar la curva de poblamiento proyectada, la dotacion semanal, el historial de solicitudes y los usuarios habilitados.</w:t>
       </w:r>
     </w:p>
     <w:p>
@@ -1446,7 +1948,7 @@
           <w:rFonts w:ascii="Arial" w:hAnsi="Arial"/>
           <w:sz w:val="22"/>
         </w:rPr>
-        <w:t>El sistema debe permitir la creacion de ordenes de trabajo categorizadas por tipo: limpieza, reparacion, cambio de colchon, cambio de cortina y reposicion de insumos.</w:t>
+        <w:t>El sistema debe permitir la creacion de ordenes de trabajo categorizadas por tipo: limpieza, reparacion, cambio de colchon, cambio de cortina, reposicion de insumos y casilleros.</w:t>
       </w:r>
     </w:p>
     <w:p>
@@ -1463,7 +1965,7 @@
           <w:rFonts w:ascii="Arial" w:hAnsi="Arial"/>
           <w:sz w:val="22"/>
         </w:rPr>
-        <w:t>El sistema debe asignar ordenes de trabajo a personal especifico y generar alertas automaticas cuando el tiempo de respuesta exceda los umbrales definidos (ej: 48 horas).</w:t>
+        <w:t>El sistema debe recibir automaticamente OTs generadas desde el check-out (limpieza y sabanas) y desde la revision de terreno (casillero liberado, danos).</w:t>
       </w:r>
     </w:p>
     <w:p>
@@ -1480,7 +1982,7 @@
           <w:rFonts w:ascii="Arial" w:hAnsi="Arial"/>
           <w:sz w:val="22"/>
         </w:rPr>
-        <w:t>El sistema debe monitorear la productividad del auxiliar de aseo, registrando camas hechas, reposiciones de insumos y limpiezas realizadas.</w:t>
+        <w:t>El sistema debe asignar ordenes de trabajo a personal especifico y generar alertas automaticas cuando el tiempo de respuesta exceda los umbrales definidos (ej: 48 horas).</w:t>
       </w:r>
     </w:p>
     <w:p>
@@ -1497,7 +1999,7 @@
           <w:rFonts w:ascii="Arial" w:hAnsi="Arial"/>
           <w:sz w:val="22"/>
         </w:rPr>
-        <w:t>El sistema debe controlar los cambios de sabanas segun el sistema de turno de cada usuario, informando al area de Facility para la planificacion del servicio.</w:t>
+        <w:t>El sistema debe monitorear la productividad del auxiliar de aseo, registrando camas hechas, reposiciones de insumos y limpiezas realizadas.</w:t>
       </w:r>
     </w:p>
     <w:p>
@@ -1514,7 +2016,24 @@
           <w:rFonts w:ascii="Arial" w:hAnsi="Arial"/>
           <w:sz w:val="22"/>
         </w:rPr>
-        <w:t>El sistema debe permitir la inspeccion de habitaciones (Camp Check) evaluando disponibilidad, limpieza, banos e insumos, con historial consultable.</w:t>
+        <w:t>El sistema debe controlar los cambios de sabanas segun el sistema de turno de cada usuario, informando al area de Facility para la planificacion del servicio.</w:t>
+      </w:r>
+    </w:p>
+    <w:p>
+      <w:r>
+        <w:rPr>
+          <w:rFonts w:ascii="Arial" w:hAnsi="Arial"/>
+          <w:b/>
+          <w:sz w:val="22"/>
+        </w:rPr>
+        <w:t xml:space="preserve">RF-3.6: </w:t>
+      </w:r>
+      <w:r>
+        <w:rPr>
+          <w:rFonts w:ascii="Arial" w:hAnsi="Arial"/>
+          <w:sz w:val="22"/>
+        </w:rPr>
+        <w:t>El sistema debe permitir la inspeccion de habitaciones (Camp Check) evaluando disponibilidad, limpieza, banos, infraestructura e insumos, con historial consultable.</w:t>
       </w:r>
     </w:p>
     <w:p>
@@ -1526,7 +2045,7 @@
           <w:rFonts w:ascii="Arial" w:hAnsi="Arial"/>
           <w:color w:val="1E293B"/>
         </w:rPr>
-        <w:t>3.4 Gestion de Tarjetas Electronicas</w:t>
+        <w:t>3.4 Gestion de Tarjetas Electronicas (Keyplus)</w:t>
       </w:r>
     </w:p>
     <w:p>
@@ -1543,7 +2062,7 @@
           <w:rFonts w:ascii="Arial" w:hAnsi="Arial"/>
           <w:sz w:val="22"/>
         </w:rPr>
-        <w:t>El sistema debe permitir la asignacion y devolucion de tarjetas maestras electronicas, registrando responsable, fecha y modulo de acceso.</w:t>
+        <w:t>El sistema debe permitir el enrolamiento de tarjetas Keyplus durante el check-in, asociandolas al huesped, habitacion y casillero.</w:t>
       </w:r>
     </w:p>
     <w:p>
@@ -1560,7 +2079,7 @@
           <w:rFonts w:ascii="Arial" w:hAnsi="Arial"/>
           <w:sz w:val="22"/>
         </w:rPr>
-        <w:t>El sistema debe soportar la importacion masiva de tarjetas desde archivos Excel.</w:t>
+        <w:t>El sistema debe permitir la asignacion y devolucion de tarjetas maestras electronicas, registrando responsable, fecha y modulo de acceso.</w:t>
       </w:r>
     </w:p>
     <w:p>
@@ -1577,7 +2096,7 @@
           <w:rFonts w:ascii="Arial" w:hAnsi="Arial"/>
           <w:sz w:val="22"/>
         </w:rPr>
-        <w:t>El sistema debe mantener una trazabilidad historica completa de cada tarjeta: asignacion, devolucion, perdida y reposicion.</w:t>
+        <w:t>El sistema debe soportar la importacion masiva de tarjetas desde archivos Excel.</w:t>
       </w:r>
     </w:p>
     <w:p>
@@ -1594,7 +2113,41 @@
           <w:rFonts w:ascii="Arial" w:hAnsi="Arial"/>
           <w:sz w:val="22"/>
         </w:rPr>
+        <w:t>El sistema debe mantener una trazabilidad historica completa de cada tarjeta: asignacion, devolucion, perdida y reposicion.</w:t>
+      </w:r>
+    </w:p>
+    <w:p>
+      <w:r>
+        <w:rPr>
+          <w:rFonts w:ascii="Arial" w:hAnsi="Arial"/>
+          <w:b/>
+          <w:sz w:val="22"/>
+        </w:rPr>
+        <w:t xml:space="preserve">RF-4.5: </w:t>
+      </w:r>
+      <w:r>
+        <w:rPr>
+          <w:rFonts w:ascii="Arial" w:hAnsi="Arial"/>
+          <w:sz w:val="22"/>
+        </w:rPr>
         <w:t>El sistema debe documentar las perdidas de tarjetas y controlar el acceso por modulo, previniendo que usuarios no autorizados identifiquen el modulo al que pueden acceder.</w:t>
+      </w:r>
+    </w:p>
+    <w:p>
+      <w:r>
+        <w:rPr>
+          <w:rFonts w:ascii="Arial" w:hAnsi="Arial"/>
+          <w:b/>
+          <w:sz w:val="22"/>
+        </w:rPr>
+        <w:t xml:space="preserve">RF-4.6: </w:t>
+      </w:r>
+      <w:r>
+        <w:rPr>
+          <w:rFonts w:ascii="Arial" w:hAnsi="Arial"/>
+          <w:sz w:val="22"/>
+        </w:rPr>
+        <w:t>El sistema debe soportar la devolucion de tarjeta en la etapa de revision de terreno del check-out, confirmando la liberacion antes de cerrar el cupo.</w:t>
       </w:r>
     </w:p>
     <w:p>
@@ -1686,7 +2239,7 @@
           <w:rFonts w:ascii="Arial" w:hAnsi="Arial"/>
           <w:color w:val="1E293B"/>
         </w:rPr>
-        <w:t>3.6 Conciliacion</w:t>
+        <w:t>3.6 Integracion y Conciliacion</w:t>
       </w:r>
     </w:p>
     <w:p>
@@ -1703,7 +2256,7 @@
           <w:rFonts w:ascii="Arial" w:hAnsi="Arial"/>
           <w:sz w:val="22"/>
         </w:rPr>
-        <w:t>El sistema debe importar datos del sistema OnTracking (asignaciones de habitaciones) y del sistema Kiplas (registros de apertura de cerraduras).</w:t>
+        <w:t>El sistema debe integrarse con OnTracking (asignaciones de habitaciones y censos), SAMTECH (registro de check-ins) y Keyplus (registros de apertura de cerraduras).</w:t>
       </w:r>
     </w:p>
     <w:p>
@@ -1720,7 +2273,7 @@
           <w:rFonts w:ascii="Arial" w:hAnsi="Arial"/>
           <w:sz w:val="22"/>
         </w:rPr>
-        <w:t>El sistema debe realizar la comparacion automatica entre ambos sistemas utilizando habitacion + timestamp como clave de cruce, dado que Kiplas no exporta RUT.</w:t>
+        <w:t>El sistema debe realizar la comparacion automatica entre los tres sistemas, utilizando RUT cuando este disponible (OnTracking/SAMTECH) y habitacion + timestamp como clave alternativa para Keyplus.</w:t>
       </w:r>
     </w:p>
     <w:p>
@@ -1737,7 +2290,7 @@
           <w:rFonts w:ascii="Arial" w:hAnsi="Arial"/>
           <w:sz w:val="22"/>
         </w:rPr>
-        <w:t>El sistema debe visualizar claramente las discrepancias encontradas: usuarios registrados en OnTracking sin apertura en Kiplas, aperturas en Kiplas sin registro en OnTracking.</w:t>
+        <w:t>El sistema debe visualizar claramente las discrepancias encontradas: registros en OnTracking sin apertura en Keyplus, aperturas en Keyplus sin registro en OnTracking/SAMTECH, y check-ins en SAMTECH sin reserva aprobada.</w:t>
       </w:r>
     </w:p>
     <w:p>
@@ -1748,6 +2301,23 @@
           <w:sz w:val="22"/>
         </w:rPr>
         <w:t xml:space="preserve">RF-6.4: </w:t>
+      </w:r>
+      <w:r>
+        <w:rPr>
+          <w:rFonts w:ascii="Arial" w:hAnsi="Arial"/>
+          <w:sz w:val="22"/>
+        </w:rPr>
+        <w:t>El sistema debe publicar el KPI de dobles asignaciones al SharePoint corporativo segun el procedimiento PR-MEL-OPFC-001 v12.</w:t>
+      </w:r>
+    </w:p>
+    <w:p>
+      <w:r>
+        <w:rPr>
+          <w:rFonts w:ascii="Arial" w:hAnsi="Arial"/>
+          <w:b/>
+          <w:sz w:val="22"/>
+        </w:rPr>
+        <w:t xml:space="preserve">RF-6.5: </w:t>
       </w:r>
       <w:r>
         <w:rPr>
@@ -1970,7 +2540,7 @@
           <w:rFonts w:ascii="Arial" w:hAnsi="Arial"/>
           <w:sz w:val="22"/>
         </w:rPr>
-        <w:t>El sistema debe exponer una API REST para integracion con OnTracking y soportar importacion de archivos del sistema Kiplas.</w:t>
+        <w:t>El sistema debe exponer una API REST para integracion con OnTracking y soportar importacion de archivos del sistema Keyplus.</w:t>
       </w:r>
     </w:p>
     <w:p>
@@ -3077,7 +3647,7 @@
           <w:b/>
           <w:sz w:val="22"/>
         </w:rPr>
-        <w:t>CU-01: Check-in de usuario permanente</w:t>
+        <w:t>CU-01: Check-in segun PR-MEL-OPFC-001 v12</w:t>
       </w:r>
     </w:p>
     <w:p>
@@ -3089,7 +3659,7 @@
           <w:rFonts w:ascii="Arial" w:hAnsi="Arial"/>
           <w:sz w:val="22"/>
         </w:rPr>
-        <w:t>Actor: Recepcionista. El recepcionista busca al usuario por RUT, verifica que la empresa tiene cupos disponibles, valida la restriccion de genero de la habitacion asignada, y registra el ingreso. El sistema actualiza la ocupacion en tiempo real.</w:t>
+        <w:t>Actor: Recepcionista. Flujo de 6 pasos: (1) validacion del huesped (RUT, autorizacion, regla 96h); (2) asignacion de habitacion, cama P/V y casillero; (3) chequeo de condiciones (aseo, sabanas, casillero, infraestructura); (4) registro en Planilla de Reservas, SAMTECH/SharePoint y enrolamiento de tarjeta Keyplus; (5) entrega del Reglamento Interno, induccion y kit; (6) actualizacion de ocupacion en tiempo real.</w:t>
       </w:r>
     </w:p>
     <w:p>
@@ -3121,7 +3691,7 @@
           <w:b/>
           <w:sz w:val="22"/>
         </w:rPr>
-        <w:t>CU-03: Carga semanal de dotacion por empresa</w:t>
+        <w:t>CU-03: Check-out automatico con revision de terreno</w:t>
       </w:r>
     </w:p>
     <w:p>
@@ -3133,7 +3703,7 @@
           <w:rFonts w:ascii="Arial" w:hAnsi="Arial"/>
           <w:sz w:val="22"/>
         </w:rPr>
-        <w:t>Actor: Administrador de Empresa. La empresa accede al portal, descarga la plantilla Excel, completa los datos de su dotacion semanal y la sube al sistema. El sistema valida automaticamente los datos y notifica discrepancias.</w:t>
+        <w:t>Actor: Recepcionista / Sistema. El sistema detecta el check-out por eventos OnTracking/Keyplus o registro manual, agrega la habitacion a la bandeja de 'Pendientes Revision Terreno'. Al completar la revision (tarjeta, llave casillero, inspeccion, pertenencias, danos, casillero liberado), el sistema genera automaticamente OTs de limpieza, sabanas y Facility si corresponde.</w:t>
       </w:r>
     </w:p>
     <w:p>
@@ -3143,7 +3713,51 @@
           <w:b/>
           <w:sz w:val="22"/>
         </w:rPr>
-        <w:t>CU-04: Recuperacion de cupos subutilizados</w:t>
+        <w:t>CU-04: Excepcion Doble Asignacion</w:t>
+      </w:r>
+    </w:p>
+    <w:p>
+      <w:pPr>
+        <w:spacing w:after="240"/>
+      </w:pPr>
+      <w:r>
+        <w:rPr>
+          <w:rFonts w:ascii="Arial" w:hAnsi="Arial"/>
+          <w:sz w:val="22"/>
+        </w:rPr>
+        <w:t>Actor: Supervisor. Cuando se detecta el intento de asignar una habitacion ya ocupada, el sistema bloquea la operacion y solicita autorizacion. Si es autorizada, se registra el incidente en el KPI-SharePoint y se notifica para reasignacion inmediata.</w:t>
+      </w:r>
+    </w:p>
+    <w:p>
+      <w:r>
+        <w:rPr>
+          <w:rFonts w:ascii="Arial" w:hAnsi="Arial"/>
+          <w:b/>
+          <w:sz w:val="22"/>
+        </w:rPr>
+        <w:t>CU-05: Solicitud semanal de dotacion con regla 96h</w:t>
+      </w:r>
+    </w:p>
+    <w:p>
+      <w:pPr>
+        <w:spacing w:after="240"/>
+      </w:pPr>
+      <w:r>
+        <w:rPr>
+          <w:rFonts w:ascii="Arial" w:hAnsi="Arial"/>
+          <w:sz w:val="22"/>
+        </w:rPr>
+        <w:t>Actor: Focal Point Empresa. La empresa accede al portal seleccionando campamento (5400/VMH/VVL/VCA), completa la curva con sistema de turno, tipo de contrato, centro de costo y clasificacion OPEX/CAPEX. El sistema valida la regla de 96h (corte Martes 18:00) y automaticamente los datos, notificando discrepancias.</w:t>
+      </w:r>
+    </w:p>
+    <w:p>
+      <w:r>
+        <w:rPr>
+          <w:rFonts w:ascii="Arial" w:hAnsi="Arial"/>
+          <w:b/>
+          <w:sz w:val="22"/>
+        </w:rPr>
+        <w:t>CU-06: Recuperacion de cupos subutilizados</w:t>
       </w:r>
     </w:p>
     <w:p>
@@ -3165,7 +3779,7 @@
           <w:b/>
           <w:sz w:val="22"/>
         </w:rPr>
-        <w:t>CU-05: Creacion y seguimiento de orden de trabajo</w:t>
+        <w:t>CU-07: Creacion y seguimiento de orden de trabajo</w:t>
       </w:r>
     </w:p>
     <w:p>
@@ -3187,7 +3801,7 @@
           <w:b/>
           <w:sz w:val="22"/>
         </w:rPr>
-        <w:t>CU-06: Conciliacion diaria OnTracking vs Kiplas</w:t>
+        <w:t>CU-08: Conciliacion diaria OnTracking / SAMTECH / Keyplus</w:t>
       </w:r>
     </w:p>
     <w:p>
@@ -3199,7 +3813,7 @@
           <w:rFonts w:ascii="Arial" w:hAnsi="Arial"/>
           <w:sz w:val="22"/>
         </w:rPr>
-        <w:t>Actor: Recepcionista/Admin. Se importan los archivos de ambos sistemas. El sistema cruza los datos por habitacion + timestamp y muestra las discrepancias para revision manual.</w:t>
+        <w:t>Actor: Recepcionista/Admin. Se importan los archivos de los tres sistemas. El sistema cruza los datos por RUT y por habitacion + timestamp, mostrando discrepancias para revision manual y publicando el KPI al SharePoint.</w:t>
       </w:r>
     </w:p>
     <w:p>
@@ -3209,7 +3823,7 @@
           <w:b/>
           <w:sz w:val="22"/>
         </w:rPr>
-        <w:t>CU-07: Inspeccion de habitacion (Camp Check)</w:t>
+        <w:t>CU-09: Inspeccion de habitacion (Camp Check)</w:t>
       </w:r>
     </w:p>
     <w:p>
@@ -3221,7 +3835,7 @@
           <w:rFonts w:ascii="Arial" w:hAnsi="Arial"/>
           <w:sz w:val="22"/>
         </w:rPr>
-        <w:t>Actor: Recepcionista. Se selecciona el modulo y habitacion, se evalua disponibilidad, limpieza, banos e insumos con calificacion Bueno/Regular/Malo. Se registran observaciones. El historial queda consultable.</w:t>
+        <w:t>Actor: Recepcionista. Se selecciona el modulo y habitacion, se evalua disponibilidad, limpieza, banos, infraestructura e insumos con calificacion Bueno/Regular/Malo. Se registran observaciones. El historial queda consultable.</w:t>
       </w:r>
     </w:p>
     <w:p>
@@ -3231,7 +3845,7 @@
           <w:b/>
           <w:sz w:val="22"/>
         </w:rPr>
-        <w:t>CU-08: Generacion de reporte de censo diario</w:t>
+        <w:t>CU-10: Generacion de reporte de censo diario</w:t>
       </w:r>
     </w:p>
     <w:p>
@@ -3243,7 +3857,7 @@
           <w:rFonts w:ascii="Arial" w:hAnsi="Arial"/>
           <w:sz w:val="22"/>
         </w:rPr>
-        <w:t>Actor: Gerencia. Se selecciona la fecha y filtros deseados. El sistema genera el reporte consolidado con ocupacion por modulo, empresa y turno. Se puede exportar a Excel o PDF.</w:t>
+        <w:t>Actor: Gerencia. Se selecciona la fecha y filtros deseados. El sistema genera el reporte consolidado con ocupacion por campamento, modulo, empresa y turno. Se puede exportar a Excel o PDF.</w:t>
       </w:r>
     </w:p>
     <w:p>
@@ -3377,7 +3991,7 @@
                 <w:rFonts w:ascii="Arial" w:hAnsi="Arial"/>
                 <w:sz w:val="20"/>
               </w:rPr>
-              <w:t>Kiplas</w:t>
+              <w:t>SAMTECH</w:t>
             </w:r>
           </w:p>
         </w:tc>
@@ -3391,7 +4005,97 @@
                 <w:rFonts w:ascii="Arial" w:hAnsi="Arial"/>
                 <w:sz w:val="20"/>
               </w:rPr>
-              <w:t>Sistema de cerraduras electronicas de origen chino utilizado en el campamento. No exporta RUT en sus reportes y tiene un limite de 1,000 columnas por informe.</w:t>
+              <w:t>Sistema corporativo utilizado para registrar check-ins, apoyando el cruce de datos con OnTracking y Keyplus.</w:t>
+            </w:r>
+          </w:p>
+        </w:tc>
+      </w:tr>
+      <w:tr>
+        <w:tc>
+          <w:tcPr>
+            <w:tcW w:type="dxa" w:w="4680"/>
+          </w:tcPr>
+          <w:p>
+            <w:r>
+              <w:rPr>
+                <w:rFonts w:ascii="Arial" w:hAnsi="Arial"/>
+                <w:sz w:val="20"/>
+              </w:rPr>
+              <w:t>Keyplus</w:t>
+            </w:r>
+          </w:p>
+        </w:tc>
+        <w:tc>
+          <w:tcPr>
+            <w:tcW w:type="dxa" w:w="4680"/>
+          </w:tcPr>
+          <w:p>
+            <w:r>
+              <w:rPr>
+                <w:rFonts w:ascii="Arial" w:hAnsi="Arial"/>
+                <w:sz w:val="20"/>
+              </w:rPr>
+              <w:t>Sistema de cerraduras electronicas utilizado en el campamento. No exporta RUT en sus reportes y tiene un limite de 1,000 columnas por informe.</w:t>
+            </w:r>
+          </w:p>
+        </w:tc>
+      </w:tr>
+      <w:tr>
+        <w:tc>
+          <w:tcPr>
+            <w:tcW w:type="dxa" w:w="4680"/>
+          </w:tcPr>
+          <w:p>
+            <w:r>
+              <w:rPr>
+                <w:rFonts w:ascii="Arial" w:hAnsi="Arial"/>
+                <w:sz w:val="20"/>
+              </w:rPr>
+              <w:t>PR-MEL-OPFC-001</w:t>
+            </w:r>
+          </w:p>
+        </w:tc>
+        <w:tc>
+          <w:tcPr>
+            <w:tcW w:type="dxa" w:w="4680"/>
+          </w:tcPr>
+          <w:p>
+            <w:r>
+              <w:rPr>
+                <w:rFonts w:ascii="Arial" w:hAnsi="Arial"/>
+                <w:sz w:val="20"/>
+              </w:rPr>
+              <w:t>Procedimiento oficial de asignacion de habitaciones, version 12 vigente desde el 31-03-2026.</w:t>
+            </w:r>
+          </w:p>
+        </w:tc>
+      </w:tr>
+      <w:tr>
+        <w:tc>
+          <w:tcPr>
+            <w:tcW w:type="dxa" w:w="4680"/>
+          </w:tcPr>
+          <w:p>
+            <w:r>
+              <w:rPr>
+                <w:rFonts w:ascii="Arial" w:hAnsi="Arial"/>
+                <w:sz w:val="20"/>
+              </w:rPr>
+              <w:t>Campamentos</w:t>
+            </w:r>
+          </w:p>
+        </w:tc>
+        <w:tc>
+          <w:tcPr>
+            <w:tcW w:type="dxa" w:w="4680"/>
+          </w:tcPr>
+          <w:p>
+            <w:r>
+              <w:rPr>
+                <w:rFonts w:ascii="Arial" w:hAnsi="Arial"/>
+                <w:sz w:val="20"/>
+              </w:rPr>
+              <w:t>El sistema soporta multiples campamentos: 5400 (BCA, principal), VMH, VVL y VCA.</w:t>
             </w:r>
           </w:p>
         </w:tc>
@@ -3422,6 +4126,246 @@
                 <w:sz w:val="20"/>
               </w:rPr>
               <w:t>Gestor designado por cada empresa que define y autoriza el ingreso de personal al campamento. Controla los cupos y sistemas de turno.</w:t>
+            </w:r>
+          </w:p>
+        </w:tc>
+      </w:tr>
+      <w:tr>
+        <w:tc>
+          <w:tcPr>
+            <w:tcW w:type="dxa" w:w="4680"/>
+          </w:tcPr>
+          <w:p>
+            <w:r>
+              <w:rPr>
+                <w:rFonts w:ascii="Arial" w:hAnsi="Arial"/>
+                <w:sz w:val="20"/>
+              </w:rPr>
+              <w:t>CO / ADC</w:t>
+            </w:r>
+          </w:p>
+        </w:tc>
+        <w:tc>
+          <w:tcPr>
+            <w:tcW w:type="dxa" w:w="4680"/>
+          </w:tcPr>
+          <w:p>
+            <w:r>
+              <w:rPr>
+                <w:rFonts w:ascii="Arial" w:hAnsi="Arial"/>
+                <w:sz w:val="20"/>
+              </w:rPr>
+              <w:t>Contract Owner y Administrador de Contrato designados por el mandante para cada contrato.</w:t>
+            </w:r>
+          </w:p>
+        </w:tc>
+      </w:tr>
+      <w:tr>
+        <w:tc>
+          <w:tcPr>
+            <w:tcW w:type="dxa" w:w="4680"/>
+          </w:tcPr>
+          <w:p>
+            <w:r>
+              <w:rPr>
+                <w:rFonts w:ascii="Arial" w:hAnsi="Arial"/>
+                <w:sz w:val="20"/>
+              </w:rPr>
+              <w:t>Focal Point</w:t>
+            </w:r>
+          </w:p>
+        </w:tc>
+        <w:tc>
+          <w:tcPr>
+            <w:tcW w:type="dxa" w:w="4680"/>
+          </w:tcPr>
+          <w:p>
+            <w:r>
+              <w:rPr>
+                <w:rFonts w:ascii="Arial" w:hAnsi="Arial"/>
+                <w:sz w:val="20"/>
+              </w:rPr>
+              <w:t>Contraparte en la empresa contratista que centraliza la carga de curva y dotacion.</w:t>
+            </w:r>
+          </w:p>
+        </w:tc>
+      </w:tr>
+      <w:tr>
+        <w:tc>
+          <w:tcPr>
+            <w:tcW w:type="dxa" w:w="4680"/>
+          </w:tcPr>
+          <w:p>
+            <w:r>
+              <w:rPr>
+                <w:rFonts w:ascii="Arial" w:hAnsi="Arial"/>
+                <w:sz w:val="20"/>
+              </w:rPr>
+              <w:t>Cama P/V</w:t>
+            </w:r>
+          </w:p>
+        </w:tc>
+        <w:tc>
+          <w:tcPr>
+            <w:tcW w:type="dxa" w:w="4680"/>
+          </w:tcPr>
+          <w:p>
+            <w:r>
+              <w:rPr>
+                <w:rFonts w:ascii="Arial" w:hAnsi="Arial"/>
+                <w:sz w:val="20"/>
+              </w:rPr>
+              <w:t>Cama Principal o Vacante. Define el rol de la cama en la asignacion dentro de la habitacion.</w:t>
+            </w:r>
+          </w:p>
+        </w:tc>
+      </w:tr>
+      <w:tr>
+        <w:tc>
+          <w:tcPr>
+            <w:tcW w:type="dxa" w:w="4680"/>
+          </w:tcPr>
+          <w:p>
+            <w:r>
+              <w:rPr>
+                <w:rFonts w:ascii="Arial" w:hAnsi="Arial"/>
+                <w:sz w:val="20"/>
+              </w:rPr>
+              <w:t>OPEX / CAPEX</w:t>
+            </w:r>
+          </w:p>
+        </w:tc>
+        <w:tc>
+          <w:tcPr>
+            <w:tcW w:type="dxa" w:w="4680"/>
+          </w:tcPr>
+          <w:p>
+            <w:r>
+              <w:rPr>
+                <w:rFonts w:ascii="Arial" w:hAnsi="Arial"/>
+                <w:sz w:val="20"/>
+              </w:rPr>
+              <w:t>Clasificacion contable del centro de costo asociado al contrato (operacional vs inversion).</w:t>
+            </w:r>
+          </w:p>
+        </w:tc>
+      </w:tr>
+      <w:tr>
+        <w:tc>
+          <w:tcPr>
+            <w:tcW w:type="dxa" w:w="4680"/>
+          </w:tcPr>
+          <w:p>
+            <w:r>
+              <w:rPr>
+                <w:rFonts w:ascii="Arial" w:hAnsi="Arial"/>
+                <w:sz w:val="20"/>
+              </w:rPr>
+              <w:t>Tipos de Contrato</w:t>
+            </w:r>
+          </w:p>
+        </w:tc>
+        <w:tc>
+          <w:tcPr>
+            <w:tcW w:type="dxa" w:w="4680"/>
+          </w:tcPr>
+          <w:p>
+            <w:r>
+              <w:rPr>
+                <w:rFonts w:ascii="Arial" w:hAnsi="Arial"/>
+                <w:sz w:val="20"/>
+              </w:rPr>
+              <w:t>Permanente, Spot, SD/PM, Outage, Proyecto y LSTS.</w:t>
+            </w:r>
+          </w:p>
+        </w:tc>
+      </w:tr>
+      <w:tr>
+        <w:tc>
+          <w:tcPr>
+            <w:tcW w:type="dxa" w:w="4680"/>
+          </w:tcPr>
+          <w:p>
+            <w:r>
+              <w:rPr>
+                <w:rFonts w:ascii="Arial" w:hAnsi="Arial"/>
+                <w:sz w:val="20"/>
+              </w:rPr>
+              <w:t>Sistemas de Turno</w:t>
+            </w:r>
+          </w:p>
+        </w:tc>
+        <w:tc>
+          <w:tcPr>
+            <w:tcW w:type="dxa" w:w="4680"/>
+          </w:tcPr>
+          <w:p>
+            <w:r>
+              <w:rPr>
+                <w:rFonts w:ascii="Arial" w:hAnsi="Arial"/>
+                <w:sz w:val="20"/>
+              </w:rPr>
+              <w:t>4x3, 7x7, 8x6, 10x10, 14x14 entre otros; cada uno con su patron dia/noche.</w:t>
+            </w:r>
+          </w:p>
+        </w:tc>
+      </w:tr>
+      <w:tr>
+        <w:tc>
+          <w:tcPr>
+            <w:tcW w:type="dxa" w:w="4680"/>
+          </w:tcPr>
+          <w:p>
+            <w:r>
+              <w:rPr>
+                <w:rFonts w:ascii="Arial" w:hAnsi="Arial"/>
+                <w:sz w:val="20"/>
+              </w:rPr>
+              <w:t>Regla 96h</w:t>
+            </w:r>
+          </w:p>
+        </w:tc>
+        <w:tc>
+          <w:tcPr>
+            <w:tcW w:type="dxa" w:w="4680"/>
+          </w:tcPr>
+          <w:p>
+            <w:r>
+              <w:rPr>
+                <w:rFonts w:ascii="Arial" w:hAnsi="Arial"/>
+                <w:sz w:val="20"/>
+              </w:rPr>
+              <w:t>Anticipacion minima de 96 horas para solicitudes de reserva; corte de curva semanal los Martes a las 18:00.</w:t>
+            </w:r>
+          </w:p>
+        </w:tc>
+      </w:tr>
+      <w:tr>
+        <w:tc>
+          <w:tcPr>
+            <w:tcW w:type="dxa" w:w="4680"/>
+          </w:tcPr>
+          <w:p>
+            <w:r>
+              <w:rPr>
+                <w:rFonts w:ascii="Arial" w:hAnsi="Arial"/>
+                <w:sz w:val="20"/>
+              </w:rPr>
+              <w:t>Doble Asignacion</w:t>
+            </w:r>
+          </w:p>
+        </w:tc>
+        <w:tc>
+          <w:tcPr>
+            <w:tcW w:type="dxa" w:w="4680"/>
+          </w:tcPr>
+          <w:p>
+            <w:r>
+              <w:rPr>
+                <w:rFonts w:ascii="Arial" w:hAnsi="Arial"/>
+                <w:sz w:val="20"/>
+              </w:rPr>
+              <w:t>Excepcion al procedimiento donde una misma habitacion queda asignada a dos huespedes; debe registrarse en el KPI-SharePoint.</w:t>
             </w:r>
           </w:p>
         </w:tc>
@@ -3601,7 +4545,7 @@
                 <w:rFonts w:ascii="Arial" w:hAnsi="Arial"/>
                 <w:sz w:val="20"/>
               </w:rPr>
-              <w:t>Orden de Trabajo. Solicitud de servicio al area de Facility (limpieza, reparacion, cambio de colchon, etc.).</w:t>
+              <w:t>Orden de Trabajo. Solicitud de servicio al area de Facility (limpieza, reparacion, cambio de colchon, casillero, etc.).</w:t>
             </w:r>
           </w:p>
         </w:tc>

</xml_diff>